<commit_message>
feat(fdm): archivero con unir PDF, conteo y filtro por login
Archiva el modelo Excel al guardar, une documentos a un PDF en el caso y limita el listado al login 1065012991 solo a casos con archivos.

Co-authored-by: Cursor <cursoragent@cursor.com>
</commit_message>
<xml_diff>
--- a/public/templates/carta-cobertura-primera-perdida-fdm.docx
+++ b/public/templates/carta-cobertura-primera-perdida-fdm.docx
@@ -588,13 +588,133 @@
       </w:r>
     </w:p>
     <w:sectPr>
+      <w:headerReference w:type="default" r:id="rId7"/>
+      <w:footerReference w:type="default" r:id="rId8"/>
       <w:pgSz w:w="12240" w:h="15840"/>
-      <w:pgMar w:top="1417" w:right="1701" w:bottom="1417" w:left="1701" w:header="708" w:footer="708" w:gutter="0"/>
+      <w:pgMar w:top="1224" w:right="1134" w:bottom="1728" w:left="1134" w:header="0" w:footer="0" w:gutter="0"/>
       <w:cols w:space="708"/>
       <w:docGrid w:linePitch="360"/>
     </w:sectPr>
   </w:body>
 </w:document>
+</file>
+
+<file path=word/footer2.xml><?xml version="1.0" encoding="utf-8"?>
+<w:ftr xmlns:r="http://schemas.openxmlformats.org/officeDocument/2006/relationships" xmlns:wp="http://schemas.openxmlformats.org/drawingml/2006/wordprocessingDrawing" xmlns:a="http://schemas.openxmlformats.org/drawingml/2006/main" xmlns:pic="http://schemas.openxmlformats.org/drawingml/2006/picture" xmlns:w="http://schemas.openxmlformats.org/wordprocessingml/2006/main" xmlns:wp14="http://schemas.microsoft.com/office/word/2010/wordprocessingDrawing" xmlns:w14="http://schemas.microsoft.com/office/word/2010/wordml" xmlns:a14="http://schemas.microsoft.com/office/drawing/2010/main" xmlns:mc="http://schemas.openxmlformats.org/markup-compatibility/2006" mc:Ignorable="w14 wp14">
+  <w:p>
+    <w:pPr>
+      <w:pStyle w:val="Footer"/>
+      <w:spacing w:before="0" w:after="0" w:line="20" w:lineRule="exact"/>
+    </w:pPr>
+    <w:r>
+      <w:rPr>
+        <w:noProof/>
+      </w:rPr>
+      <w:drawing>
+        <wp:anchor distT="0" distB="0" distL="0" distR="0" simplePos="0" relativeHeight="251660288" behindDoc="1" locked="0" layoutInCell="1" allowOverlap="1">
+          <wp:simplePos x="0" y="0"/>
+          <wp:positionH relativeFrom="page">
+            <wp:posOffset>0</wp:posOffset>
+          </wp:positionH>
+          <wp:positionV relativeFrom="page">
+            <wp:posOffset>9201247</wp:posOffset>
+          </wp:positionV>
+          <wp:extent cx="7772400" cy="857153"/>
+          <wp:effectExtent l="0" t="0" r="0" b="0"/>
+          <wp:wrapNone/>
+          <wp:docPr id="2" name="Membrete pie Equidad"/>
+          <wp:cNvGraphicFramePr>
+            <a:graphicFrameLocks noChangeAspect="0"/>
+          </wp:cNvGraphicFramePr>
+          <a:graphic>
+            <a:graphicData uri="http://schemas.openxmlformats.org/drawingml/2006/picture">
+              <pic:pic>
+                <pic:nvPicPr>
+                  <pic:cNvPr id="2" name="Membrete pie Equidad"/>
+                  <pic:cNvPicPr/>
+                </pic:nvPicPr>
+                <pic:blipFill>
+                  <a:blip r:embed="rId1"/>
+                  <a:stretch>
+                    <a:fillRect/>
+                  </a:stretch>
+                </pic:blipFill>
+                <pic:spPr>
+                  <a:xfrm>
+                    <a:off x="0" y="0"/>
+                    <a:ext cx="7772400" cy="857153"/>
+                  </a:xfrm>
+                  <a:prstGeom prst="rect">
+                    <a:avLst/>
+                  </a:prstGeom>
+                </pic:spPr>
+              </pic:pic>
+            </a:graphicData>
+          </a:graphic>
+        </wp:anchor>
+      </w:drawing>
+    </w:r>
+  </w:p>
+</w:ftr>
+</file>
+
+<file path=word/header2.xml><?xml version="1.0" encoding="utf-8"?>
+<w:hdr xmlns:r="http://schemas.openxmlformats.org/officeDocument/2006/relationships" xmlns:wp="http://schemas.openxmlformats.org/drawingml/2006/wordprocessingDrawing" xmlns:a="http://schemas.openxmlformats.org/drawingml/2006/main" xmlns:pic="http://schemas.openxmlformats.org/drawingml/2006/picture" xmlns:w="http://schemas.openxmlformats.org/wordprocessingml/2006/main" xmlns:wp14="http://schemas.microsoft.com/office/word/2010/wordprocessingDrawing" xmlns:w14="http://schemas.microsoft.com/office/word/2010/wordml" xmlns:a14="http://schemas.microsoft.com/office/drawing/2010/main" xmlns:mc="http://schemas.openxmlformats.org/markup-compatibility/2006" mc:Ignorable="w14 wp14">
+  <w:p>
+    <w:pPr>
+      <w:pStyle w:val="Header"/>
+      <w:spacing w:before="0" w:after="0" w:line="20" w:lineRule="exact"/>
+    </w:pPr>
+    <w:r>
+      <w:rPr>
+        <w:noProof/>
+      </w:rPr>
+      <w:drawing>
+        <wp:anchor distT="0" distB="0" distL="0" distR="0" simplePos="0" relativeHeight="251658240" behindDoc="1" locked="0" layoutInCell="1" allowOverlap="1">
+          <wp:simplePos x="0" y="0"/>
+          <wp:positionH relativeFrom="page">
+            <wp:posOffset>0</wp:posOffset>
+          </wp:positionH>
+          <wp:positionV relativeFrom="page">
+            <wp:posOffset>0</wp:posOffset>
+          </wp:positionV>
+          <wp:extent cx="7772400" cy="658368"/>
+          <wp:effectExtent l="0" t="0" r="0" b="0"/>
+          <wp:wrapNone/>
+          <wp:docPr id="1" name="Membrete encabezado Equidad"/>
+          <wp:cNvGraphicFramePr>
+            <a:graphicFrameLocks noChangeAspect="0"/>
+          </wp:cNvGraphicFramePr>
+          <a:graphic>
+            <a:graphicData uri="http://schemas.openxmlformats.org/drawingml/2006/picture">
+              <pic:pic>
+                <pic:nvPicPr>
+                  <pic:cNvPr id="1" name="Membrete encabezado Equidad"/>
+                  <pic:cNvPicPr/>
+                </pic:nvPicPr>
+                <pic:blipFill>
+                  <a:blip r:embed="rId1"/>
+                  <a:stretch>
+                    <a:fillRect/>
+                  </a:stretch>
+                </pic:blipFill>
+                <pic:spPr>
+                  <a:xfrm>
+                    <a:off x="0" y="0"/>
+                    <a:ext cx="7772400" cy="658368"/>
+                  </a:xfrm>
+                  <a:prstGeom prst="rect">
+                    <a:avLst/>
+                  </a:prstGeom>
+                </pic:spPr>
+              </pic:pic>
+            </a:graphicData>
+          </a:graphic>
+        </wp:anchor>
+      </w:drawing>
+    </w:r>
+  </w:p>
+</w:hdr>
 </file>
 
 <file path=word/numbering.xml><?xml version="1.0" encoding="utf-8"?>

</xml_diff>